<commit_message>
Mis a jour du rapport
</commit_message>
<xml_diff>
--- a/docs/Rapport clustering plat.docx
+++ b/docs/Rapport clustering plat.docx
@@ -665,7 +665,7 @@
                 </mc:Choice>
                 <mc:Fallback>
                   <w:pict>
-                    <v:group w14:anchorId="5981845B" id="Group 479" o:spid="_x0000_s1026" style="width:106pt;height:.7pt;mso-position-horizontal-relative:char;mso-position-vertical-relative:line" coordsize="13462,91" o:gfxdata="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">
+                    <v:group w14:anchorId="72745A82" id="Group 479" o:spid="_x0000_s1026" style="width:106pt;height:.7pt;mso-position-horizontal-relative:char;mso-position-vertical-relative:line" coordsize="13462,91" o:gfxdata="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">
                       <v:shape id="Shape 49" o:spid="_x0000_s1027" style="position:absolute;width:13462;height:0;visibility:visible;mso-wrap-style:square;v-text-anchor:top" coordsize="1346200,0" o:gfxdata="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" path="m,l1346200,e" filled="f" strokeweight=".72pt">
                         <v:stroke miterlimit="1" joinstyle="miter"/>
                         <v:path arrowok="t" textboxrect="0,0,1346200,0"/>
@@ -872,8 +872,6 @@
               </w:rPr>
               <w:t xml:space="preserve">Présenté par </w:t>
             </w:r>
-            <w:bookmarkStart w:id="0" w:name="_GoBack"/>
-            <w:bookmarkEnd w:id="0"/>
             <w:r>
               <w:rPr>
                 <w:rFonts w:ascii="Times New Roman" w:hAnsi="Times New Roman" w:cs="Times New Roman"/>
@@ -980,7 +978,42 @@
                                       <w:b/>
                                       <w:bCs/>
                                     </w:rPr>
-                                    <w:t>Présentation et exploration des données</w:t>
+                                    <w:t>Présentation,</w:t>
+                                  </w:r>
+                                  <w:r>
+                                    <w:rPr>
+                                      <w:b/>
+                                      <w:bCs/>
+                                    </w:rPr>
+                                    <w:t xml:space="preserve"> exploration</w:t>
+                                  </w:r>
+                                  <w:r>
+                                    <w:rPr>
+                                      <w:b/>
+                                      <w:bCs/>
+                                    </w:rPr>
+                                    <w:t xml:space="preserve"> et pr</w:t>
+                                  </w:r>
+                                  <w:r>
+                                    <w:rPr>
+                                      <w:b/>
+                                      <w:bCs/>
+                                    </w:rPr>
+                                    <w:t>étrait</w:t>
+                                  </w:r>
+                                  <w:r>
+                                    <w:rPr>
+                                      <w:b/>
+                                      <w:bCs/>
+                                    </w:rPr>
+                                    <w:t>ement</w:t>
+                                  </w:r>
+                                  <w:r>
+                                    <w:rPr>
+                                      <w:b/>
+                                      <w:bCs/>
+                                    </w:rPr>
+                                    <w:t xml:space="preserve"> des données</w:t>
                                   </w:r>
                                 </w:p>
                                 <w:p>
@@ -1157,7 +1190,42 @@
                                 <w:b/>
                                 <w:bCs/>
                               </w:rPr>
-                              <w:t>Présentation et exploration des données</w:t>
+                              <w:t>Présentation,</w:t>
+                            </w:r>
+                            <w:r>
+                              <w:rPr>
+                                <w:b/>
+                                <w:bCs/>
+                              </w:rPr>
+                              <w:t xml:space="preserve"> exploration</w:t>
+                            </w:r>
+                            <w:r>
+                              <w:rPr>
+                                <w:b/>
+                                <w:bCs/>
+                              </w:rPr>
+                              <w:t xml:space="preserve"> et pr</w:t>
+                            </w:r>
+                            <w:r>
+                              <w:rPr>
+                                <w:b/>
+                                <w:bCs/>
+                              </w:rPr>
+                              <w:t>étrait</w:t>
+                            </w:r>
+                            <w:r>
+                              <w:rPr>
+                                <w:b/>
+                                <w:bCs/>
+                              </w:rPr>
+                              <w:t>ement</w:t>
+                            </w:r>
+                            <w:r>
+                              <w:rPr>
+                                <w:b/>
+                                <w:bCs/>
+                              </w:rPr>
+                              <w:t xml:space="preserve"> des données</w:t>
                             </w:r>
                           </w:p>
                           <w:p>
@@ -1521,6 +1589,707 @@
     </w:tbl>
     <w:p>
       <w:pPr>
+        <w:pStyle w:val="Titre1"/>
+        <w:spacing w:line="360" w:lineRule="auto"/>
+        <w:jc w:val="center"/>
+        <w:rPr>
+          <w:rStyle w:val="cf01"/>
+          <w:rFonts w:ascii="Times New Roman" w:hAnsi="Times New Roman"/>
+          <w:b/>
+          <w:color w:val="000000" w:themeColor="text1"/>
+          <w:sz w:val="32"/>
+          <w:szCs w:val="24"/>
+        </w:rPr>
+      </w:pPr>
+      <w:r>
+        <w:rPr>
+          <w:rStyle w:val="cf01"/>
+          <w:rFonts w:ascii="Times New Roman" w:hAnsi="Times New Roman"/>
+          <w:b/>
+          <w:color w:val="000000" w:themeColor="text1"/>
+          <w:sz w:val="32"/>
+          <w:szCs w:val="24"/>
+        </w:rPr>
+        <w:lastRenderedPageBreak/>
+        <w:t>Introduction</w:t>
+      </w:r>
+    </w:p>
+    <w:p>
+      <w:pPr>
+        <w:pStyle w:val="NormalWeb"/>
+        <w:numPr>
+          <w:ilvl w:val="0"/>
+          <w:numId w:val="32"/>
+        </w:numPr>
+        <w:spacing w:after="0" w:afterAutospacing="0" w:line="360" w:lineRule="auto"/>
+        <w:rPr>
+          <w:b/>
+        </w:rPr>
+      </w:pPr>
+      <w:r>
+        <w:rPr>
+          <w:rStyle w:val="cf01"/>
+          <w:rFonts w:ascii="Times New Roman" w:hAnsi="Times New Roman"/>
+          <w:b/>
+          <w:sz w:val="24"/>
+          <w:szCs w:val="24"/>
+        </w:rPr>
+        <w:t>Problématique</w:t>
+      </w:r>
+    </w:p>
+    <w:p>
+      <w:pPr>
+        <w:pStyle w:val="NormalWeb"/>
+        <w:spacing w:line="360" w:lineRule="auto"/>
+      </w:pPr>
+      <w:r>
+        <w:rPr>
+          <w:rStyle w:val="cf11"/>
+          <w:rFonts w:ascii="Times New Roman" w:hAnsi="Times New Roman"/>
+          <w:sz w:val="24"/>
+          <w:szCs w:val="24"/>
+        </w:rPr>
+        <w:t xml:space="preserve">L’essor massif des données textuelles dans le domaine du cinéma, notamment à travers les synopsis, genres, et descriptions d’acteurs des films, pose un défi important en termes d’organisation, d’analyse et d’exploitation. Face à ce volume croissant, il devient difficile d’identifier manuellement des regroupements thématiques ou des catégories utiles à la recommandation, à la recherche ou à l’analyse de tendances. Le </w:t>
+      </w:r>
+      <w:proofErr w:type="spellStart"/>
+      <w:r>
+        <w:rPr>
+          <w:rStyle w:val="cf11"/>
+          <w:rFonts w:ascii="Times New Roman" w:hAnsi="Times New Roman"/>
+          <w:sz w:val="24"/>
+          <w:szCs w:val="24"/>
+        </w:rPr>
+        <w:t>clustering</w:t>
+      </w:r>
+      <w:proofErr w:type="spellEnd"/>
+      <w:r>
+        <w:rPr>
+          <w:rStyle w:val="cf11"/>
+          <w:rFonts w:ascii="Times New Roman" w:hAnsi="Times New Roman"/>
+          <w:sz w:val="24"/>
+          <w:szCs w:val="24"/>
+        </w:rPr>
+        <w:t xml:space="preserve">, ou classification non supervisée, offre une approche efficace pour segmenter automatiquement un large corpus de films en groupes cohérents basés sur leurs caractéristiques textuelles et numériques. La question centrale est donc : </w:t>
+      </w:r>
+      <w:r>
+        <w:rPr>
+          <w:rStyle w:val="cf21"/>
+          <w:rFonts w:ascii="Times New Roman" w:hAnsi="Times New Roman"/>
+          <w:sz w:val="24"/>
+          <w:szCs w:val="24"/>
+        </w:rPr>
+        <w:t>Comment regrouper de manière pertinente les films en clusters exploitables à partir de leurs métadonnées et contenus textuels ?</w:t>
+      </w:r>
+    </w:p>
+    <w:p>
+      <w:pPr>
+        <w:pStyle w:val="NormalWeb"/>
+        <w:numPr>
+          <w:ilvl w:val="0"/>
+          <w:numId w:val="32"/>
+        </w:numPr>
+        <w:spacing w:after="0" w:afterAutospacing="0" w:line="360" w:lineRule="auto"/>
+        <w:rPr>
+          <w:b/>
+        </w:rPr>
+      </w:pPr>
+      <w:r>
+        <w:rPr>
+          <w:rStyle w:val="cf01"/>
+          <w:rFonts w:ascii="Times New Roman" w:hAnsi="Times New Roman"/>
+          <w:b/>
+          <w:sz w:val="24"/>
+          <w:szCs w:val="24"/>
+        </w:rPr>
+        <w:t>Objectifs et motivation</w:t>
+      </w:r>
+    </w:p>
+    <w:p>
+      <w:pPr>
+        <w:pStyle w:val="NormalWeb"/>
+        <w:spacing w:line="360" w:lineRule="auto"/>
+      </w:pPr>
+      <w:r>
+        <w:rPr>
+          <w:rStyle w:val="cf01"/>
+          <w:rFonts w:ascii="Times New Roman" w:hAnsi="Times New Roman"/>
+          <w:sz w:val="24"/>
+          <w:szCs w:val="24"/>
+        </w:rPr>
+        <w:t xml:space="preserve">Ce projet vise à développer un modèle d’apprentissage non supervisé pour segmenter les films issus du </w:t>
+      </w:r>
+      <w:proofErr w:type="spellStart"/>
+      <w:r>
+        <w:rPr>
+          <w:rStyle w:val="cf01"/>
+          <w:rFonts w:ascii="Times New Roman" w:hAnsi="Times New Roman"/>
+          <w:sz w:val="24"/>
+          <w:szCs w:val="24"/>
+        </w:rPr>
+        <w:t>dataset</w:t>
+      </w:r>
+      <w:proofErr w:type="spellEnd"/>
+      <w:r>
+        <w:rPr>
+          <w:rStyle w:val="cf01"/>
+          <w:rFonts w:ascii="Times New Roman" w:hAnsi="Times New Roman"/>
+          <w:sz w:val="24"/>
+          <w:szCs w:val="24"/>
+        </w:rPr>
+        <w:t xml:space="preserve"> TMDB_5000_movies à l’aide d’algorithmes de </w:t>
+      </w:r>
+      <w:proofErr w:type="spellStart"/>
+      <w:r>
+        <w:rPr>
+          <w:rStyle w:val="cf01"/>
+          <w:rFonts w:ascii="Times New Roman" w:hAnsi="Times New Roman"/>
+          <w:sz w:val="24"/>
+          <w:szCs w:val="24"/>
+        </w:rPr>
+        <w:t>clustering</w:t>
+      </w:r>
+      <w:proofErr w:type="spellEnd"/>
+      <w:r>
+        <w:rPr>
+          <w:rStyle w:val="cf01"/>
+          <w:rFonts w:ascii="Times New Roman" w:hAnsi="Times New Roman"/>
+          <w:sz w:val="24"/>
+          <w:szCs w:val="24"/>
+        </w:rPr>
+        <w:t xml:space="preserve"> plat, en particulier </w:t>
+      </w:r>
+      <w:r>
+        <w:rPr>
+          <w:rStyle w:val="cf31"/>
+          <w:rFonts w:ascii="Times New Roman" w:hAnsi="Times New Roman"/>
+          <w:sz w:val="24"/>
+          <w:szCs w:val="24"/>
+        </w:rPr>
+        <w:t>k-</w:t>
+      </w:r>
+      <w:proofErr w:type="spellStart"/>
+      <w:r>
+        <w:rPr>
+          <w:rStyle w:val="cf31"/>
+          <w:rFonts w:ascii="Times New Roman" w:hAnsi="Times New Roman"/>
+          <w:sz w:val="24"/>
+          <w:szCs w:val="24"/>
+        </w:rPr>
+        <w:t>means</w:t>
+      </w:r>
+      <w:proofErr w:type="spellEnd"/>
+      <w:r>
+        <w:rPr>
+          <w:rStyle w:val="cf01"/>
+          <w:rFonts w:ascii="Times New Roman" w:hAnsi="Times New Roman"/>
+          <w:sz w:val="24"/>
+          <w:szCs w:val="24"/>
+        </w:rPr>
+        <w:t xml:space="preserve">. L’objectif est d’explorer la structure sous-jacente des films, de détecter des regroupements thématiques ou commerciaux, et de voir dans quelle mesure ces clusters peuvent servir la recommandation ou l’analyse marketing. </w:t>
+      </w:r>
+      <w:r>
+        <w:rPr>
+          <w:rStyle w:val="cf41"/>
+          <w:rFonts w:ascii="Times New Roman" w:hAnsi="Times New Roman"/>
+          <w:sz w:val="24"/>
+          <w:szCs w:val="24"/>
+        </w:rPr>
+        <w:t>M</w:t>
+      </w:r>
+      <w:r>
+        <w:rPr>
+          <w:rStyle w:val="cf01"/>
+          <w:rFonts w:ascii="Times New Roman" w:hAnsi="Times New Roman"/>
+          <w:sz w:val="24"/>
+          <w:szCs w:val="24"/>
+        </w:rPr>
+        <w:t>otivé par l’intersection entre traitement automatique des langues et data science appliquée à un domaine culturel riche, ce qui permet d’allier une dimension technique et une compréhension fine de contenus audiovisuels.</w:t>
+      </w:r>
+    </w:p>
+    <w:p>
+      <w:pPr>
+        <w:pStyle w:val="NormalWeb"/>
+        <w:numPr>
+          <w:ilvl w:val="0"/>
+          <w:numId w:val="32"/>
+        </w:numPr>
+        <w:spacing w:after="0" w:afterAutospacing="0" w:line="360" w:lineRule="auto"/>
+        <w:rPr>
+          <w:b/>
+        </w:rPr>
+      </w:pPr>
+      <w:r>
+        <w:rPr>
+          <w:rStyle w:val="cf01"/>
+          <w:rFonts w:ascii="Times New Roman" w:hAnsi="Times New Roman"/>
+          <w:b/>
+          <w:sz w:val="24"/>
+          <w:szCs w:val="24"/>
+        </w:rPr>
+        <w:t>Questions de recherche</w:t>
+      </w:r>
+    </w:p>
+    <w:p>
+      <w:pPr>
+        <w:pStyle w:val="NormalWeb"/>
+        <w:numPr>
+          <w:ilvl w:val="0"/>
+          <w:numId w:val="31"/>
+        </w:numPr>
+        <w:spacing w:line="360" w:lineRule="auto"/>
+      </w:pPr>
+      <w:r>
+        <w:rPr>
+          <w:rStyle w:val="cf01"/>
+          <w:rFonts w:ascii="Times New Roman" w:hAnsi="Times New Roman"/>
+          <w:sz w:val="24"/>
+          <w:szCs w:val="24"/>
+        </w:rPr>
+        <w:t xml:space="preserve">Comment exploiter efficacement les caractéristiques textuelles et numériques du </w:t>
+      </w:r>
+      <w:proofErr w:type="spellStart"/>
+      <w:r>
+        <w:rPr>
+          <w:rStyle w:val="cf01"/>
+          <w:rFonts w:ascii="Times New Roman" w:hAnsi="Times New Roman"/>
+          <w:sz w:val="24"/>
+          <w:szCs w:val="24"/>
+        </w:rPr>
+        <w:t>dataset</w:t>
+      </w:r>
+      <w:proofErr w:type="spellEnd"/>
+      <w:r>
+        <w:rPr>
+          <w:rStyle w:val="cf01"/>
+          <w:rFonts w:ascii="Times New Roman" w:hAnsi="Times New Roman"/>
+          <w:sz w:val="24"/>
+          <w:szCs w:val="24"/>
+        </w:rPr>
+        <w:t xml:space="preserve"> TMDB pour générer des clusters pertinents ?</w:t>
+      </w:r>
+    </w:p>
+    <w:p>
+      <w:pPr>
+        <w:pStyle w:val="NormalWeb"/>
+        <w:numPr>
+          <w:ilvl w:val="0"/>
+          <w:numId w:val="31"/>
+        </w:numPr>
+        <w:spacing w:line="360" w:lineRule="auto"/>
+      </w:pPr>
+      <w:r>
+        <w:rPr>
+          <w:rStyle w:val="cf01"/>
+          <w:rFonts w:ascii="Times New Roman" w:hAnsi="Times New Roman"/>
+          <w:sz w:val="24"/>
+          <w:szCs w:val="24"/>
+        </w:rPr>
+        <w:t>Quel est le nombre optimal de clusters qui reflète la diversité des films ?</w:t>
+      </w:r>
+    </w:p>
+    <w:p>
+      <w:pPr>
+        <w:pStyle w:val="NormalWeb"/>
+        <w:numPr>
+          <w:ilvl w:val="0"/>
+          <w:numId w:val="31"/>
+        </w:numPr>
+        <w:spacing w:line="360" w:lineRule="auto"/>
+      </w:pPr>
+      <w:r>
+        <w:rPr>
+          <w:rStyle w:val="cf01"/>
+          <w:rFonts w:ascii="Times New Roman" w:hAnsi="Times New Roman"/>
+          <w:sz w:val="24"/>
+          <w:szCs w:val="24"/>
+        </w:rPr>
+        <w:t>Dans quelle mesure les clusters issus du k-</w:t>
+      </w:r>
+      <w:proofErr w:type="spellStart"/>
+      <w:r>
+        <w:rPr>
+          <w:rStyle w:val="cf01"/>
+          <w:rFonts w:ascii="Times New Roman" w:hAnsi="Times New Roman"/>
+          <w:sz w:val="24"/>
+          <w:szCs w:val="24"/>
+        </w:rPr>
+        <w:t>means</w:t>
+      </w:r>
+      <w:proofErr w:type="spellEnd"/>
+      <w:r>
+        <w:rPr>
+          <w:rStyle w:val="cf01"/>
+          <w:rFonts w:ascii="Times New Roman" w:hAnsi="Times New Roman"/>
+          <w:sz w:val="24"/>
+          <w:szCs w:val="24"/>
+        </w:rPr>
+        <w:t xml:space="preserve"> correspondent ils aux genres officiels ou profils d’audience ?</w:t>
+      </w:r>
+    </w:p>
+    <w:p>
+      <w:pPr>
+        <w:pStyle w:val="NormalWeb"/>
+        <w:numPr>
+          <w:ilvl w:val="0"/>
+          <w:numId w:val="31"/>
+        </w:numPr>
+        <w:spacing w:line="360" w:lineRule="auto"/>
+      </w:pPr>
+      <w:r>
+        <w:rPr>
+          <w:rStyle w:val="cf01"/>
+          <w:rFonts w:ascii="Times New Roman" w:hAnsi="Times New Roman"/>
+          <w:sz w:val="24"/>
+          <w:szCs w:val="24"/>
+        </w:rPr>
+        <w:t>Peut-on utiliser ces clusters pour améliorer des systèmes de recommandation ou la segmentation marketing ?</w:t>
+      </w:r>
+    </w:p>
+    <w:p>
+      <w:pPr>
+        <w:pStyle w:val="NormalWeb"/>
+        <w:spacing w:line="360" w:lineRule="auto"/>
+      </w:pPr>
+      <w:r>
+        <w:rPr>
+          <w:rStyle w:val="cf01"/>
+          <w:rFonts w:ascii="Times New Roman" w:hAnsi="Times New Roman"/>
+          <w:sz w:val="24"/>
+          <w:szCs w:val="24"/>
+        </w:rPr>
+        <w:lastRenderedPageBreak/>
+        <w:t xml:space="preserve">Quelles limites rencontrent les méthodes de </w:t>
+      </w:r>
+      <w:proofErr w:type="spellStart"/>
+      <w:r>
+        <w:rPr>
+          <w:rStyle w:val="cf01"/>
+          <w:rFonts w:ascii="Times New Roman" w:hAnsi="Times New Roman"/>
+          <w:sz w:val="24"/>
+          <w:szCs w:val="24"/>
+        </w:rPr>
+        <w:t>clustering</w:t>
+      </w:r>
+      <w:proofErr w:type="spellEnd"/>
+      <w:r>
+        <w:rPr>
+          <w:rStyle w:val="cf01"/>
+          <w:rFonts w:ascii="Times New Roman" w:hAnsi="Times New Roman"/>
+          <w:sz w:val="24"/>
+          <w:szCs w:val="24"/>
+        </w:rPr>
+        <w:t xml:space="preserve"> plat dans ce contexte et comment les dépasser ?</w:t>
+      </w:r>
+    </w:p>
+    <w:p>
+      <w:pPr>
+        <w:pStyle w:val="NormalWeb"/>
+        <w:numPr>
+          <w:ilvl w:val="0"/>
+          <w:numId w:val="32"/>
+        </w:numPr>
+        <w:spacing w:after="0" w:afterAutospacing="0" w:line="360" w:lineRule="auto"/>
+        <w:rPr>
+          <w:b/>
+        </w:rPr>
+      </w:pPr>
+      <w:r>
+        <w:rPr>
+          <w:rStyle w:val="cf01"/>
+          <w:rFonts w:ascii="Times New Roman" w:hAnsi="Times New Roman"/>
+          <w:b/>
+          <w:sz w:val="24"/>
+          <w:szCs w:val="24"/>
+        </w:rPr>
+        <w:t>Travaux connexes</w:t>
+      </w:r>
+    </w:p>
+    <w:p>
+      <w:pPr>
+        <w:pStyle w:val="NormalWeb"/>
+        <w:spacing w:line="360" w:lineRule="auto"/>
+      </w:pPr>
+      <w:r>
+        <w:rPr>
+          <w:rStyle w:val="cf01"/>
+          <w:rFonts w:ascii="Times New Roman" w:hAnsi="Times New Roman"/>
+          <w:sz w:val="24"/>
+          <w:szCs w:val="24"/>
+        </w:rPr>
+        <w:t xml:space="preserve">Le </w:t>
+      </w:r>
+      <w:proofErr w:type="spellStart"/>
+      <w:r>
+        <w:rPr>
+          <w:rStyle w:val="cf01"/>
+          <w:rFonts w:ascii="Times New Roman" w:hAnsi="Times New Roman"/>
+          <w:sz w:val="24"/>
+          <w:szCs w:val="24"/>
+        </w:rPr>
+        <w:t>clustering</w:t>
+      </w:r>
+      <w:proofErr w:type="spellEnd"/>
+      <w:r>
+        <w:rPr>
+          <w:rStyle w:val="cf01"/>
+          <w:rFonts w:ascii="Times New Roman" w:hAnsi="Times New Roman"/>
+          <w:sz w:val="24"/>
+          <w:szCs w:val="24"/>
+        </w:rPr>
+        <w:t xml:space="preserve"> non supervisé, notamment via l’algorithme k-</w:t>
+      </w:r>
+      <w:proofErr w:type="spellStart"/>
+      <w:r>
+        <w:rPr>
+          <w:rStyle w:val="cf01"/>
+          <w:rFonts w:ascii="Times New Roman" w:hAnsi="Times New Roman"/>
+          <w:sz w:val="24"/>
+          <w:szCs w:val="24"/>
+        </w:rPr>
+        <w:t>means</w:t>
+      </w:r>
+      <w:proofErr w:type="spellEnd"/>
+      <w:r>
+        <w:rPr>
+          <w:rStyle w:val="cf01"/>
+          <w:rFonts w:ascii="Times New Roman" w:hAnsi="Times New Roman"/>
+          <w:sz w:val="24"/>
+          <w:szCs w:val="24"/>
+        </w:rPr>
+        <w:t xml:space="preserve">, est une technique classique en fouille de textes et data </w:t>
+      </w:r>
+      <w:proofErr w:type="spellStart"/>
+      <w:r>
+        <w:rPr>
+          <w:rStyle w:val="cf01"/>
+          <w:rFonts w:ascii="Times New Roman" w:hAnsi="Times New Roman"/>
+          <w:sz w:val="24"/>
+          <w:szCs w:val="24"/>
+        </w:rPr>
+        <w:t>mining</w:t>
+      </w:r>
+      <w:proofErr w:type="spellEnd"/>
+      <w:r>
+        <w:rPr>
+          <w:rStyle w:val="cf01"/>
+          <w:rFonts w:ascii="Times New Roman" w:hAnsi="Times New Roman"/>
+          <w:sz w:val="24"/>
+          <w:szCs w:val="24"/>
+        </w:rPr>
+        <w:t>, largement utilisée pour structurer des corpus documentaires. Dans le contexte cinématographique, plusieurs travaux ont exploité ces méthodes pour la recommandation de films, combinant souvent la vectorisation TF-IDF des synopsis avec des métadonnées. Ces méthodes permettent d’identifier des regroupements exploitables, même si certaines limites subsistent sur la qualité et l’</w:t>
+      </w:r>
+      <w:proofErr w:type="spellStart"/>
+      <w:r>
+        <w:rPr>
+          <w:rStyle w:val="cf01"/>
+          <w:rFonts w:ascii="Times New Roman" w:hAnsi="Times New Roman"/>
+          <w:sz w:val="24"/>
+          <w:szCs w:val="24"/>
+        </w:rPr>
+        <w:t>interprétabilité</w:t>
+      </w:r>
+      <w:proofErr w:type="spellEnd"/>
+      <w:r>
+        <w:rPr>
+          <w:rStyle w:val="cf01"/>
+          <w:rFonts w:ascii="Times New Roman" w:hAnsi="Times New Roman"/>
+          <w:sz w:val="24"/>
+          <w:szCs w:val="24"/>
+        </w:rPr>
+        <w:t xml:space="preserve"> des clusters obtenus.</w:t>
+      </w:r>
+    </w:p>
+    <w:p>
+      <w:pPr>
+        <w:pStyle w:val="NormalWeb"/>
+        <w:numPr>
+          <w:ilvl w:val="0"/>
+          <w:numId w:val="32"/>
+        </w:numPr>
+        <w:spacing w:line="360" w:lineRule="auto"/>
+        <w:rPr>
+          <w:b/>
+        </w:rPr>
+      </w:pPr>
+      <w:r>
+        <w:rPr>
+          <w:rStyle w:val="cf01"/>
+          <w:rFonts w:ascii="Times New Roman" w:hAnsi="Times New Roman"/>
+          <w:b/>
+          <w:sz w:val="24"/>
+          <w:szCs w:val="24"/>
+        </w:rPr>
+        <w:t>Plan du projet</w:t>
+      </w:r>
+    </w:p>
+    <w:p>
+      <w:pPr>
+        <w:pStyle w:val="NormalWeb"/>
+        <w:numPr>
+          <w:ilvl w:val="0"/>
+          <w:numId w:val="33"/>
+        </w:numPr>
+        <w:spacing w:line="360" w:lineRule="auto"/>
+      </w:pPr>
+      <w:r>
+        <w:rPr>
+          <w:rStyle w:val="cf01"/>
+          <w:rFonts w:ascii="Times New Roman" w:hAnsi="Times New Roman"/>
+          <w:sz w:val="24"/>
+          <w:szCs w:val="24"/>
+        </w:rPr>
+        <w:t>État de l’art</w:t>
+      </w:r>
+    </w:p>
+    <w:p>
+      <w:pPr>
+        <w:pStyle w:val="NormalWeb"/>
+        <w:numPr>
+          <w:ilvl w:val="0"/>
+          <w:numId w:val="33"/>
+        </w:numPr>
+        <w:spacing w:line="360" w:lineRule="auto"/>
+      </w:pPr>
+      <w:r>
+        <w:rPr>
+          <w:rStyle w:val="cf01"/>
+          <w:rFonts w:ascii="Times New Roman" w:hAnsi="Times New Roman"/>
+          <w:sz w:val="24"/>
+          <w:szCs w:val="24"/>
+        </w:rPr>
+        <w:t xml:space="preserve">Présentation du </w:t>
+      </w:r>
+      <w:proofErr w:type="spellStart"/>
+      <w:r>
+        <w:rPr>
+          <w:rStyle w:val="cf01"/>
+          <w:rFonts w:ascii="Times New Roman" w:hAnsi="Times New Roman"/>
+          <w:sz w:val="24"/>
+          <w:szCs w:val="24"/>
+        </w:rPr>
+        <w:t>dataset</w:t>
+      </w:r>
+      <w:proofErr w:type="spellEnd"/>
+      <w:r>
+        <w:rPr>
+          <w:rStyle w:val="cf01"/>
+          <w:rFonts w:ascii="Times New Roman" w:hAnsi="Times New Roman"/>
+          <w:sz w:val="24"/>
+          <w:szCs w:val="24"/>
+        </w:rPr>
+        <w:t xml:space="preserve"> TMDB, exploration et prétraitement des données.</w:t>
+      </w:r>
+    </w:p>
+    <w:p>
+      <w:pPr>
+        <w:pStyle w:val="NormalWeb"/>
+        <w:numPr>
+          <w:ilvl w:val="0"/>
+          <w:numId w:val="33"/>
+        </w:numPr>
+        <w:spacing w:line="360" w:lineRule="auto"/>
+      </w:pPr>
+      <w:r>
+        <w:rPr>
+          <w:rStyle w:val="cf01"/>
+          <w:rFonts w:ascii="Times New Roman" w:hAnsi="Times New Roman"/>
+          <w:sz w:val="24"/>
+          <w:szCs w:val="24"/>
+        </w:rPr>
+        <w:t xml:space="preserve">Description de la méthodologie de </w:t>
+      </w:r>
+      <w:proofErr w:type="spellStart"/>
+      <w:r>
+        <w:rPr>
+          <w:rStyle w:val="cf01"/>
+          <w:rFonts w:ascii="Times New Roman" w:hAnsi="Times New Roman"/>
+          <w:sz w:val="24"/>
+          <w:szCs w:val="24"/>
+        </w:rPr>
+        <w:t>clustering</w:t>
+      </w:r>
+      <w:proofErr w:type="spellEnd"/>
+      <w:r>
+        <w:rPr>
+          <w:rStyle w:val="cf01"/>
+          <w:rFonts w:ascii="Times New Roman" w:hAnsi="Times New Roman"/>
+          <w:sz w:val="24"/>
+          <w:szCs w:val="24"/>
+        </w:rPr>
+        <w:t xml:space="preserve"> utilisée, choix des algorithmes et paramétrage.</w:t>
+      </w:r>
+    </w:p>
+    <w:p>
+      <w:pPr>
+        <w:pStyle w:val="NormalWeb"/>
+        <w:numPr>
+          <w:ilvl w:val="0"/>
+          <w:numId w:val="33"/>
+        </w:numPr>
+        <w:spacing w:line="360" w:lineRule="auto"/>
+        <w:rPr>
+          <w:rStyle w:val="cf01"/>
+          <w:rFonts w:ascii="Times New Roman" w:hAnsi="Times New Roman"/>
+          <w:sz w:val="24"/>
+          <w:szCs w:val="24"/>
+        </w:rPr>
+      </w:pPr>
+      <w:r>
+        <w:rPr>
+          <w:rStyle w:val="cf01"/>
+          <w:rFonts w:ascii="Times New Roman" w:hAnsi="Times New Roman"/>
+          <w:sz w:val="24"/>
+          <w:szCs w:val="24"/>
+        </w:rPr>
+        <w:t>Résultats, visualisations, évaluations quantitatives et qualitatives des clusters.</w:t>
+      </w:r>
+    </w:p>
+    <w:p>
+      <w:pPr>
+        <w:pStyle w:val="NormalWeb"/>
+        <w:numPr>
+          <w:ilvl w:val="0"/>
+          <w:numId w:val="33"/>
+        </w:numPr>
+        <w:spacing w:line="360" w:lineRule="auto"/>
+        <w:rPr>
+          <w:rStyle w:val="cf01"/>
+          <w:rFonts w:ascii="Times New Roman" w:hAnsi="Times New Roman"/>
+          <w:sz w:val="24"/>
+          <w:szCs w:val="24"/>
+        </w:rPr>
+      </w:pPr>
+      <w:r>
+        <w:rPr>
+          <w:rStyle w:val="cf01"/>
+          <w:rFonts w:ascii="Times New Roman" w:hAnsi="Times New Roman"/>
+          <w:sz w:val="24"/>
+          <w:szCs w:val="24"/>
+        </w:rPr>
+        <w:t>Discussion, limite du projet et perspectives futures.</w:t>
+      </w:r>
+    </w:p>
+    <w:p>
+      <w:pPr>
+        <w:pStyle w:val="NormalWeb"/>
+        <w:numPr>
+          <w:ilvl w:val="0"/>
+          <w:numId w:val="33"/>
+        </w:numPr>
+        <w:spacing w:line="360" w:lineRule="auto"/>
+      </w:pPr>
+      <w:r>
+        <w:rPr>
+          <w:rStyle w:val="cf01"/>
+          <w:rFonts w:ascii="Times New Roman" w:hAnsi="Times New Roman"/>
+          <w:sz w:val="24"/>
+          <w:szCs w:val="24"/>
+        </w:rPr>
+        <w:t>Conclusion générale.</w:t>
+      </w:r>
+    </w:p>
+    <w:p>
+      <w:pPr>
         <w:rPr>
           <w:rFonts w:ascii="Times New Roman" w:eastAsia="Times New Roman" w:hAnsi="Times New Roman" w:cs="Times New Roman"/>
           <w:b/>
@@ -1538,7 +2307,6 @@
           <w:sz w:val="28"/>
           <w:lang w:eastAsia="fr-FR"/>
         </w:rPr>
-        <w:lastRenderedPageBreak/>
         <w:br w:type="page"/>
       </w:r>
     </w:p>
@@ -1547,7 +2315,49 @@
         <w:pStyle w:val="Titre1"/>
         <w:numPr>
           <w:ilvl w:val="0"/>
-          <w:numId w:val="20"/>
+          <w:numId w:val="35"/>
+        </w:numPr>
+        <w:spacing w:before="0" w:after="240" w:line="360" w:lineRule="auto"/>
+        <w:jc w:val="center"/>
+        <w:rPr>
+          <w:rFonts w:ascii="Times New Roman" w:eastAsia="Times New Roman" w:hAnsi="Times New Roman" w:cs="Times New Roman"/>
+          <w:b/>
+          <w:color w:val="000000" w:themeColor="text1"/>
+          <w:sz w:val="24"/>
+          <w:szCs w:val="20"/>
+          <w:lang w:eastAsia="fr-FR"/>
+        </w:rPr>
+      </w:pPr>
+      <w:r>
+        <w:rPr>
+          <w:rStyle w:val="cf01"/>
+          <w:rFonts w:ascii="Times New Roman" w:hAnsi="Times New Roman" w:cs="Times New Roman"/>
+          <w:b/>
+          <w:color w:val="000000" w:themeColor="text1"/>
+          <w:sz w:val="32"/>
+          <w:szCs w:val="24"/>
+        </w:rPr>
+        <w:lastRenderedPageBreak/>
+        <w:t>État</w:t>
+      </w:r>
+      <w:r>
+        <w:rPr>
+          <w:rStyle w:val="cf01"/>
+          <w:rFonts w:ascii="Times New Roman" w:hAnsi="Times New Roman" w:cs="Times New Roman"/>
+          <w:b/>
+          <w:color w:val="000000" w:themeColor="text1"/>
+          <w:sz w:val="32"/>
+          <w:szCs w:val="24"/>
+        </w:rPr>
+        <w:t xml:space="preserve"> de l’art</w:t>
+      </w:r>
+    </w:p>
+    <w:p>
+      <w:pPr>
+        <w:pStyle w:val="Titre1"/>
+        <w:numPr>
+          <w:ilvl w:val="0"/>
+          <w:numId w:val="35"/>
         </w:numPr>
         <w:spacing w:before="0" w:after="240" w:line="360" w:lineRule="auto"/>
         <w:jc w:val="center"/>
@@ -1567,9 +2377,46 @@
           <w:color w:val="000000" w:themeColor="text1"/>
           <w:lang w:eastAsia="fr-FR"/>
         </w:rPr>
-        <w:lastRenderedPageBreak/>
-        <w:t>Présentation et exploration des données</w:t>
-      </w:r>
+        <w:t>Présentation,</w:t>
+      </w:r>
+      <w:r>
+        <w:rPr>
+          <w:rFonts w:ascii="Times New Roman" w:eastAsia="Times New Roman" w:hAnsi="Times New Roman" w:cs="Times New Roman"/>
+          <w:b/>
+          <w:color w:val="000000" w:themeColor="text1"/>
+          <w:lang w:eastAsia="fr-FR"/>
+        </w:rPr>
+        <w:t xml:space="preserve"> exploration </w:t>
+      </w:r>
+      <w:r>
+        <w:rPr>
+          <w:rFonts w:ascii="Times New Roman" w:eastAsia="Times New Roman" w:hAnsi="Times New Roman" w:cs="Times New Roman"/>
+          <w:b/>
+          <w:color w:val="000000" w:themeColor="text1"/>
+          <w:lang w:eastAsia="fr-FR"/>
+        </w:rPr>
+        <w:t>et pr</w:t>
+      </w:r>
+      <w:r>
+        <w:rPr>
+          <w:rFonts w:ascii="Times New Roman" w:eastAsia="Times New Roman" w:hAnsi="Times New Roman" w:cs="Times New Roman"/>
+          <w:b/>
+          <w:color w:val="000000" w:themeColor="text1"/>
+          <w:lang w:eastAsia="fr-FR"/>
+        </w:rPr>
+        <w:t xml:space="preserve">étraitement </w:t>
+      </w:r>
+      <w:r>
+        <w:rPr>
+          <w:rFonts w:ascii="Times New Roman" w:eastAsia="Times New Roman" w:hAnsi="Times New Roman" w:cs="Times New Roman"/>
+          <w:b/>
+          <w:color w:val="000000" w:themeColor="text1"/>
+          <w:lang w:eastAsia="fr-FR"/>
+        </w:rPr>
+        <w:t>des données</w:t>
+      </w:r>
+      <w:bookmarkStart w:id="0" w:name="_GoBack"/>
+      <w:bookmarkEnd w:id="0"/>
     </w:p>
     <w:p>
       <w:pPr>
@@ -2181,6 +3028,7 @@
           <w:szCs w:val="24"/>
           <w:lang w:eastAsia="fr-FR"/>
         </w:rPr>
+        <w:lastRenderedPageBreak/>
         <w:t>popularity</w:t>
       </w:r>
       <w:proofErr w:type="spellEnd"/>
@@ -2289,7 +3137,6 @@
           <w:szCs w:val="24"/>
           <w:lang w:eastAsia="fr-FR"/>
         </w:rPr>
-        <w:lastRenderedPageBreak/>
         <w:t>vote</w:t>
       </w:r>
       <w:proofErr w:type="gramEnd"/>
@@ -3865,6 +4712,7 @@
                 <w:szCs w:val="24"/>
                 <w:lang w:eastAsia="fr-FR"/>
               </w:rPr>
+              <w:lastRenderedPageBreak/>
               <w:t>runtime</w:t>
             </w:r>
             <w:proofErr w:type="spellEnd"/>
@@ -4520,14 +5368,6 @@
           <w:lang w:eastAsia="fr-FR"/>
         </w:rPr>
         <w:br/>
-      </w:r>
-      <w:r>
-        <w:rPr>
-          <w:rFonts w:ascii="Times New Roman" w:eastAsia="Times New Roman" w:hAnsi="Times New Roman" w:cs="Times New Roman"/>
-          <w:sz w:val="24"/>
-          <w:lang w:eastAsia="fr-FR"/>
-        </w:rPr>
-        <w:lastRenderedPageBreak/>
         <w:t>La popularité varie fortement, comme le nombre de votes.</w:t>
       </w:r>
       <w:r>
@@ -5014,7 +5854,16 @@
           <w:sz w:val="24"/>
           <w:lang w:eastAsia="fr-FR"/>
         </w:rPr>
-        <w:t xml:space="preserve"> TMDB, qui contient des informations sur environ 5000 films. Cette étape vise à éliminer les doublons, à gérer les valeurs manquantes, et à s’assurer que les données soient cohérentes et exploitables.</w:t>
+        <w:t xml:space="preserve"> TMDB, qui contient des informations sur environ 5000 </w:t>
+      </w:r>
+      <w:r>
+        <w:rPr>
+          <w:rFonts w:ascii="Times New Roman" w:eastAsia="Times New Roman" w:hAnsi="Times New Roman" w:cs="Times New Roman"/>
+          <w:sz w:val="24"/>
+          <w:lang w:eastAsia="fr-FR"/>
+        </w:rPr>
+        <w:lastRenderedPageBreak/>
+        <w:t>films. Cette étape vise à éliminer les doublons, à gérer les valeurs manquantes, et à s’assurer que les données soient cohérentes et exploitables.</w:t>
       </w:r>
     </w:p>
     <w:p>
@@ -5087,7 +5936,6 @@
           <w:sz w:val="24"/>
           <w:lang w:eastAsia="fr-FR"/>
         </w:rPr>
-        <w:lastRenderedPageBreak/>
         <w:t>Résultat</w:t>
       </w:r>
       <w:r>
@@ -5958,6 +6806,7 @@
           <w:sz w:val="24"/>
           <w:lang w:eastAsia="fr-FR"/>
         </w:rPr>
+        <w:lastRenderedPageBreak/>
         <w:t xml:space="preserve">Le nettoyage a permis d’obtenir un </w:t>
       </w:r>
       <w:proofErr w:type="spellStart"/>
@@ -6025,7 +6874,6 @@
           <w:u w:val="single"/>
           <w:lang w:eastAsia="fr-FR"/>
         </w:rPr>
-        <w:lastRenderedPageBreak/>
         <w:t>Prétraitement textuel des synopsis</w:t>
       </w:r>
     </w:p>
@@ -6755,6 +7603,7 @@
           <w:sz w:val="24"/>
           <w:lang w:eastAsia="fr-FR"/>
         </w:rPr>
+        <w:lastRenderedPageBreak/>
         <w:t>Conversion des textes en minuscules pour uniformiser la casse.</w:t>
       </w:r>
     </w:p>
@@ -6886,7 +7735,6 @@
           <w:sz w:val="24"/>
           <w:lang w:eastAsia="fr-FR"/>
         </w:rPr>
-        <w:lastRenderedPageBreak/>
         <w:t xml:space="preserve">Comparaison avec </w:t>
       </w:r>
       <w:proofErr w:type="gramStart"/>
@@ -7476,6 +8324,7 @@
           <w:u w:val="single"/>
           <w:lang w:eastAsia="fr-FR"/>
         </w:rPr>
+        <w:lastRenderedPageBreak/>
         <w:t xml:space="preserve">Vectorisation textuelle (TF-IDF ou </w:t>
       </w:r>
       <w:proofErr w:type="spellStart"/>
@@ -7660,7 +8509,6 @@
           <w:szCs w:val="24"/>
           <w:lang w:val="en" w:eastAsia="fr-FR"/>
         </w:rPr>
-        <w:lastRenderedPageBreak/>
         <w:t>Embeddings</w:t>
       </w:r>
       <w:proofErr w:type="spellEnd"/>
@@ -8144,6 +8992,7 @@
           <w:szCs w:val="24"/>
           <w:lang w:eastAsia="fr-FR"/>
         </w:rPr>
+        <w:lastRenderedPageBreak/>
         <w:t xml:space="preserve">Le prétraitement textuel des synopsis est une étape essentielle pour la réussite de l’analyse sémantique et du </w:t>
       </w:r>
       <w:proofErr w:type="spellStart"/>
@@ -8302,10 +9151,9 @@
         <w:pStyle w:val="Titre1"/>
         <w:numPr>
           <w:ilvl w:val="0"/>
-          <w:numId w:val="26"/>
+          <w:numId w:val="35"/>
         </w:numPr>
         <w:spacing w:before="360" w:after="80" w:line="278" w:lineRule="auto"/>
-        <w:jc w:val="center"/>
         <w:rPr>
           <w:rFonts w:ascii="Times New Roman" w:eastAsia="Times New Roman" w:hAnsi="Times New Roman" w:cs="Times New Roman"/>
           <w:b/>
@@ -8320,7 +9168,6 @@
           <w:color w:val="000000" w:themeColor="text1"/>
           <w:lang w:eastAsia="fr-FR"/>
         </w:rPr>
-        <w:lastRenderedPageBreak/>
         <w:t>Méthodologies</w:t>
       </w:r>
     </w:p>
@@ -9277,6 +10124,7 @@
           <w:lang w:eastAsia="fr-FR"/>
           <w14:ligatures w14:val="standardContextual"/>
         </w:rPr>
+        <w:lastRenderedPageBreak/>
         <w:drawing>
           <wp:anchor distT="0" distB="0" distL="114300" distR="114300" simplePos="0" relativeHeight="251661312" behindDoc="1" locked="0" layoutInCell="1" allowOverlap="1" wp14:anchorId="57E6317B" wp14:editId="35052914">
             <wp:simplePos x="0" y="0"/>
@@ -9365,7 +10213,6 @@
           <w:u w:val="single"/>
           <w:lang w:eastAsia="fr-FR"/>
         </w:rPr>
-        <w:lastRenderedPageBreak/>
         <w:t>Justification des Choix Méthodologiques</w:t>
       </w:r>
     </w:p>
@@ -10181,6 +11028,7 @@
           <w:rFonts w:ascii="Times New Roman" w:eastAsia="Times New Roman" w:hAnsi="Times New Roman" w:cs="Times New Roman"/>
           <w:lang w:eastAsia="fr-FR"/>
         </w:rPr>
+        <w:lastRenderedPageBreak/>
         <w:t>c'est</w:t>
       </w:r>
       <w:proofErr w:type="gramEnd"/>
@@ -10420,7 +11268,6 @@
           <w:rFonts w:ascii="Times New Roman" w:eastAsia="Times New Roman" w:hAnsi="Times New Roman" w:cs="Times New Roman"/>
           <w:lang w:eastAsia="fr-FR"/>
         </w:rPr>
-        <w:lastRenderedPageBreak/>
         <w:t>Le "</w:t>
       </w:r>
       <w:r>
@@ -11010,7 +11857,15 @@
           <w:rFonts w:ascii="Times New Roman" w:eastAsia="Times New Roman" w:hAnsi="Times New Roman" w:cs="Times New Roman"/>
           <w:lang w:eastAsia="fr-FR"/>
         </w:rPr>
-        <w:t>dans un tel espace. Pour pouvoir représenter graphiquement nos clusters, nous avons eu</w:t>
+        <w:t xml:space="preserve">dans un tel espace. Pour pouvoir </w:t>
+      </w:r>
+      <w:r>
+        <w:rPr>
+          <w:rFonts w:ascii="Times New Roman" w:eastAsia="Times New Roman" w:hAnsi="Times New Roman" w:cs="Times New Roman"/>
+          <w:lang w:eastAsia="fr-FR"/>
+        </w:rPr>
+        <w:lastRenderedPageBreak/>
+        <w:t>représenter graphiquement nos clusters, nous avons eu</w:t>
       </w:r>
       <w:r>
         <w:rPr>
@@ -11917,6 +12772,92 @@
     </w:lvl>
   </w:abstractNum>
   <w:abstractNum w:abstractNumId="5" w15:restartNumberingAfterBreak="0">
+    <w:nsid w:val="0C530BEC"/>
+    <w:multiLevelType w:val="hybridMultilevel"/>
+    <w:tmpl w:val="83BC414A"/>
+    <w:lvl w:ilvl="0" w:tplc="040C000F">
+      <w:start w:val="1"/>
+      <w:numFmt w:val="decimal"/>
+      <w:lvlText w:val="%1."/>
+      <w:lvlJc w:val="left"/>
+      <w:pPr>
+        <w:ind w:left="720" w:hanging="360"/>
+      </w:pPr>
+    </w:lvl>
+    <w:lvl w:ilvl="1" w:tplc="040C0019" w:tentative="1">
+      <w:start w:val="1"/>
+      <w:numFmt w:val="lowerLetter"/>
+      <w:lvlText w:val="%2."/>
+      <w:lvlJc w:val="left"/>
+      <w:pPr>
+        <w:ind w:left="1440" w:hanging="360"/>
+      </w:pPr>
+    </w:lvl>
+    <w:lvl w:ilvl="2" w:tplc="040C001B" w:tentative="1">
+      <w:start w:val="1"/>
+      <w:numFmt w:val="lowerRoman"/>
+      <w:lvlText w:val="%3."/>
+      <w:lvlJc w:val="right"/>
+      <w:pPr>
+        <w:ind w:left="2160" w:hanging="180"/>
+      </w:pPr>
+    </w:lvl>
+    <w:lvl w:ilvl="3" w:tplc="040C000F" w:tentative="1">
+      <w:start w:val="1"/>
+      <w:numFmt w:val="decimal"/>
+      <w:lvlText w:val="%4."/>
+      <w:lvlJc w:val="left"/>
+      <w:pPr>
+        <w:ind w:left="2880" w:hanging="360"/>
+      </w:pPr>
+    </w:lvl>
+    <w:lvl w:ilvl="4" w:tplc="040C0019" w:tentative="1">
+      <w:start w:val="1"/>
+      <w:numFmt w:val="lowerLetter"/>
+      <w:lvlText w:val="%5."/>
+      <w:lvlJc w:val="left"/>
+      <w:pPr>
+        <w:ind w:left="3600" w:hanging="360"/>
+      </w:pPr>
+    </w:lvl>
+    <w:lvl w:ilvl="5" w:tplc="040C001B" w:tentative="1">
+      <w:start w:val="1"/>
+      <w:numFmt w:val="lowerRoman"/>
+      <w:lvlText w:val="%6."/>
+      <w:lvlJc w:val="right"/>
+      <w:pPr>
+        <w:ind w:left="4320" w:hanging="180"/>
+      </w:pPr>
+    </w:lvl>
+    <w:lvl w:ilvl="6" w:tplc="040C000F" w:tentative="1">
+      <w:start w:val="1"/>
+      <w:numFmt w:val="decimal"/>
+      <w:lvlText w:val="%7."/>
+      <w:lvlJc w:val="left"/>
+      <w:pPr>
+        <w:ind w:left="5040" w:hanging="360"/>
+      </w:pPr>
+    </w:lvl>
+    <w:lvl w:ilvl="7" w:tplc="040C0019" w:tentative="1">
+      <w:start w:val="1"/>
+      <w:numFmt w:val="lowerLetter"/>
+      <w:lvlText w:val="%8."/>
+      <w:lvlJc w:val="left"/>
+      <w:pPr>
+        <w:ind w:left="5760" w:hanging="360"/>
+      </w:pPr>
+    </w:lvl>
+    <w:lvl w:ilvl="8" w:tplc="040C001B" w:tentative="1">
+      <w:start w:val="1"/>
+      <w:numFmt w:val="lowerRoman"/>
+      <w:lvlText w:val="%9."/>
+      <w:lvlJc w:val="right"/>
+      <w:pPr>
+        <w:ind w:left="6480" w:hanging="180"/>
+      </w:pPr>
+    </w:lvl>
+  </w:abstractNum>
+  <w:abstractNum w:abstractNumId="6" w15:restartNumberingAfterBreak="0">
     <w:nsid w:val="0CA96007"/>
     <w:multiLevelType w:val="multilevel"/>
     <w:tmpl w:val="94F4B91E"/>
@@ -12065,7 +13006,7 @@
       </w:rPr>
     </w:lvl>
   </w:abstractNum>
-  <w:abstractNum w:abstractNumId="6" w15:restartNumberingAfterBreak="0">
+  <w:abstractNum w:abstractNumId="7" w15:restartNumberingAfterBreak="0">
     <w:nsid w:val="186E6D1F"/>
     <w:multiLevelType w:val="multilevel"/>
     <w:tmpl w:val="373671A2"/>
@@ -12214,7 +13155,7 @@
       </w:rPr>
     </w:lvl>
   </w:abstractNum>
-  <w:abstractNum w:abstractNumId="7" w15:restartNumberingAfterBreak="0">
+  <w:abstractNum w:abstractNumId="8" w15:restartNumberingAfterBreak="0">
     <w:nsid w:val="1C9E00C4"/>
     <w:multiLevelType w:val="multilevel"/>
     <w:tmpl w:val="07D6E53C"/>
@@ -12363,7 +13304,7 @@
       </w:rPr>
     </w:lvl>
   </w:abstractNum>
-  <w:abstractNum w:abstractNumId="8" w15:restartNumberingAfterBreak="0">
+  <w:abstractNum w:abstractNumId="9" w15:restartNumberingAfterBreak="0">
     <w:nsid w:val="1D0C7E38"/>
     <w:multiLevelType w:val="multilevel"/>
     <w:tmpl w:val="DBD05BD0"/>
@@ -12512,7 +13453,7 @@
       </w:rPr>
     </w:lvl>
   </w:abstractNum>
-  <w:abstractNum w:abstractNumId="9" w15:restartNumberingAfterBreak="0">
+  <w:abstractNum w:abstractNumId="10" w15:restartNumberingAfterBreak="0">
     <w:nsid w:val="1FCC1FE4"/>
     <w:multiLevelType w:val="hybridMultilevel"/>
     <w:tmpl w:val="A9909B18"/>
@@ -12625,7 +13566,7 @@
       </w:rPr>
     </w:lvl>
   </w:abstractNum>
-  <w:abstractNum w:abstractNumId="10" w15:restartNumberingAfterBreak="0">
+  <w:abstractNum w:abstractNumId="11" w15:restartNumberingAfterBreak="0">
     <w:nsid w:val="201503B9"/>
     <w:multiLevelType w:val="hybridMultilevel"/>
     <w:tmpl w:val="CEA0854A"/>
@@ -12738,7 +13679,7 @@
       </w:rPr>
     </w:lvl>
   </w:abstractNum>
-  <w:abstractNum w:abstractNumId="11" w15:restartNumberingAfterBreak="0">
+  <w:abstractNum w:abstractNumId="12" w15:restartNumberingAfterBreak="0">
     <w:nsid w:val="27EE0AE9"/>
     <w:multiLevelType w:val="multilevel"/>
     <w:tmpl w:val="944A7D44"/>
@@ -12887,7 +13828,7 @@
       </w:rPr>
     </w:lvl>
   </w:abstractNum>
-  <w:abstractNum w:abstractNumId="12" w15:restartNumberingAfterBreak="0">
+  <w:abstractNum w:abstractNumId="13" w15:restartNumberingAfterBreak="0">
     <w:nsid w:val="2F562061"/>
     <w:multiLevelType w:val="hybridMultilevel"/>
     <w:tmpl w:val="0EF4E176"/>
@@ -12973,7 +13914,120 @@
       </w:pPr>
     </w:lvl>
   </w:abstractNum>
-  <w:abstractNum w:abstractNumId="13" w15:restartNumberingAfterBreak="0">
+  <w:abstractNum w:abstractNumId="14" w15:restartNumberingAfterBreak="0">
+    <w:nsid w:val="305D2DFA"/>
+    <w:multiLevelType w:val="hybridMultilevel"/>
+    <w:tmpl w:val="FF96DEE4"/>
+    <w:lvl w:ilvl="0" w:tplc="040C000B">
+      <w:start w:val="1"/>
+      <w:numFmt w:val="bullet"/>
+      <w:lvlText w:val=""/>
+      <w:lvlJc w:val="left"/>
+      <w:pPr>
+        <w:ind w:left="1068" w:hanging="360"/>
+      </w:pPr>
+      <w:rPr>
+        <w:rFonts w:ascii="Wingdings" w:hAnsi="Wingdings" w:hint="default"/>
+      </w:rPr>
+    </w:lvl>
+    <w:lvl w:ilvl="1" w:tplc="040C0003" w:tentative="1">
+      <w:start w:val="1"/>
+      <w:numFmt w:val="bullet"/>
+      <w:lvlText w:val="o"/>
+      <w:lvlJc w:val="left"/>
+      <w:pPr>
+        <w:ind w:left="1788" w:hanging="360"/>
+      </w:pPr>
+      <w:rPr>
+        <w:rFonts w:ascii="Courier New" w:hAnsi="Courier New" w:cs="Courier New" w:hint="default"/>
+      </w:rPr>
+    </w:lvl>
+    <w:lvl w:ilvl="2" w:tplc="040C0005" w:tentative="1">
+      <w:start w:val="1"/>
+      <w:numFmt w:val="bullet"/>
+      <w:lvlText w:val=""/>
+      <w:lvlJc w:val="left"/>
+      <w:pPr>
+        <w:ind w:left="2508" w:hanging="360"/>
+      </w:pPr>
+      <w:rPr>
+        <w:rFonts w:ascii="Wingdings" w:hAnsi="Wingdings" w:hint="default"/>
+      </w:rPr>
+    </w:lvl>
+    <w:lvl w:ilvl="3" w:tplc="040C0001" w:tentative="1">
+      <w:start w:val="1"/>
+      <w:numFmt w:val="bullet"/>
+      <w:lvlText w:val=""/>
+      <w:lvlJc w:val="left"/>
+      <w:pPr>
+        <w:ind w:left="3228" w:hanging="360"/>
+      </w:pPr>
+      <w:rPr>
+        <w:rFonts w:ascii="Symbol" w:hAnsi="Symbol" w:hint="default"/>
+      </w:rPr>
+    </w:lvl>
+    <w:lvl w:ilvl="4" w:tplc="040C0003" w:tentative="1">
+      <w:start w:val="1"/>
+      <w:numFmt w:val="bullet"/>
+      <w:lvlText w:val="o"/>
+      <w:lvlJc w:val="left"/>
+      <w:pPr>
+        <w:ind w:left="3948" w:hanging="360"/>
+      </w:pPr>
+      <w:rPr>
+        <w:rFonts w:ascii="Courier New" w:hAnsi="Courier New" w:cs="Courier New" w:hint="default"/>
+      </w:rPr>
+    </w:lvl>
+    <w:lvl w:ilvl="5" w:tplc="040C0005" w:tentative="1">
+      <w:start w:val="1"/>
+      <w:numFmt w:val="bullet"/>
+      <w:lvlText w:val=""/>
+      <w:lvlJc w:val="left"/>
+      <w:pPr>
+        <w:ind w:left="4668" w:hanging="360"/>
+      </w:pPr>
+      <w:rPr>
+        <w:rFonts w:ascii="Wingdings" w:hAnsi="Wingdings" w:hint="default"/>
+      </w:rPr>
+    </w:lvl>
+    <w:lvl w:ilvl="6" w:tplc="040C0001" w:tentative="1">
+      <w:start w:val="1"/>
+      <w:numFmt w:val="bullet"/>
+      <w:lvlText w:val=""/>
+      <w:lvlJc w:val="left"/>
+      <w:pPr>
+        <w:ind w:left="5388" w:hanging="360"/>
+      </w:pPr>
+      <w:rPr>
+        <w:rFonts w:ascii="Symbol" w:hAnsi="Symbol" w:hint="default"/>
+      </w:rPr>
+    </w:lvl>
+    <w:lvl w:ilvl="7" w:tplc="040C0003" w:tentative="1">
+      <w:start w:val="1"/>
+      <w:numFmt w:val="bullet"/>
+      <w:lvlText w:val="o"/>
+      <w:lvlJc w:val="left"/>
+      <w:pPr>
+        <w:ind w:left="6108" w:hanging="360"/>
+      </w:pPr>
+      <w:rPr>
+        <w:rFonts w:ascii="Courier New" w:hAnsi="Courier New" w:cs="Courier New" w:hint="default"/>
+      </w:rPr>
+    </w:lvl>
+    <w:lvl w:ilvl="8" w:tplc="040C0005" w:tentative="1">
+      <w:start w:val="1"/>
+      <w:numFmt w:val="bullet"/>
+      <w:lvlText w:val=""/>
+      <w:lvlJc w:val="left"/>
+      <w:pPr>
+        <w:ind w:left="6828" w:hanging="360"/>
+      </w:pPr>
+      <w:rPr>
+        <w:rFonts w:ascii="Wingdings" w:hAnsi="Wingdings" w:hint="default"/>
+      </w:rPr>
+    </w:lvl>
+  </w:abstractNum>
+  <w:abstractNum w:abstractNumId="15" w15:restartNumberingAfterBreak="0">
     <w:nsid w:val="35C62375"/>
     <w:multiLevelType w:val="hybridMultilevel"/>
     <w:tmpl w:val="F7005C6C"/>
@@ -13059,7 +14113,7 @@
       </w:pPr>
     </w:lvl>
   </w:abstractNum>
-  <w:abstractNum w:abstractNumId="14" w15:restartNumberingAfterBreak="0">
+  <w:abstractNum w:abstractNumId="16" w15:restartNumberingAfterBreak="0">
     <w:nsid w:val="37200537"/>
     <w:multiLevelType w:val="hybridMultilevel"/>
     <w:tmpl w:val="F3E679AA"/>
@@ -13148,7 +14202,7 @@
       </w:pPr>
     </w:lvl>
   </w:abstractNum>
-  <w:abstractNum w:abstractNumId="15" w15:restartNumberingAfterBreak="0">
+  <w:abstractNum w:abstractNumId="17" w15:restartNumberingAfterBreak="0">
     <w:nsid w:val="37520105"/>
     <w:multiLevelType w:val="hybridMultilevel"/>
     <w:tmpl w:val="F65E1F5A"/>
@@ -13239,7 +14293,93 @@
       </w:pPr>
     </w:lvl>
   </w:abstractNum>
-  <w:abstractNum w:abstractNumId="16" w15:restartNumberingAfterBreak="0">
+  <w:abstractNum w:abstractNumId="18" w15:restartNumberingAfterBreak="0">
+    <w:nsid w:val="3EEF06DA"/>
+    <w:multiLevelType w:val="hybridMultilevel"/>
+    <w:tmpl w:val="302450B2"/>
+    <w:lvl w:ilvl="0" w:tplc="040C0013">
+      <w:start w:val="1"/>
+      <w:numFmt w:val="upperRoman"/>
+      <w:lvlText w:val="%1."/>
+      <w:lvlJc w:val="right"/>
+      <w:pPr>
+        <w:ind w:left="720" w:hanging="360"/>
+      </w:pPr>
+    </w:lvl>
+    <w:lvl w:ilvl="1" w:tplc="040C0019" w:tentative="1">
+      <w:start w:val="1"/>
+      <w:numFmt w:val="lowerLetter"/>
+      <w:lvlText w:val="%2."/>
+      <w:lvlJc w:val="left"/>
+      <w:pPr>
+        <w:ind w:left="1440" w:hanging="360"/>
+      </w:pPr>
+    </w:lvl>
+    <w:lvl w:ilvl="2" w:tplc="040C001B" w:tentative="1">
+      <w:start w:val="1"/>
+      <w:numFmt w:val="lowerRoman"/>
+      <w:lvlText w:val="%3."/>
+      <w:lvlJc w:val="right"/>
+      <w:pPr>
+        <w:ind w:left="2160" w:hanging="180"/>
+      </w:pPr>
+    </w:lvl>
+    <w:lvl w:ilvl="3" w:tplc="040C000F" w:tentative="1">
+      <w:start w:val="1"/>
+      <w:numFmt w:val="decimal"/>
+      <w:lvlText w:val="%4."/>
+      <w:lvlJc w:val="left"/>
+      <w:pPr>
+        <w:ind w:left="2880" w:hanging="360"/>
+      </w:pPr>
+    </w:lvl>
+    <w:lvl w:ilvl="4" w:tplc="040C0019" w:tentative="1">
+      <w:start w:val="1"/>
+      <w:numFmt w:val="lowerLetter"/>
+      <w:lvlText w:val="%5."/>
+      <w:lvlJc w:val="left"/>
+      <w:pPr>
+        <w:ind w:left="3600" w:hanging="360"/>
+      </w:pPr>
+    </w:lvl>
+    <w:lvl w:ilvl="5" w:tplc="040C001B" w:tentative="1">
+      <w:start w:val="1"/>
+      <w:numFmt w:val="lowerRoman"/>
+      <w:lvlText w:val="%6."/>
+      <w:lvlJc w:val="right"/>
+      <w:pPr>
+        <w:ind w:left="4320" w:hanging="180"/>
+      </w:pPr>
+    </w:lvl>
+    <w:lvl w:ilvl="6" w:tplc="040C000F" w:tentative="1">
+      <w:start w:val="1"/>
+      <w:numFmt w:val="decimal"/>
+      <w:lvlText w:val="%7."/>
+      <w:lvlJc w:val="left"/>
+      <w:pPr>
+        <w:ind w:left="5040" w:hanging="360"/>
+      </w:pPr>
+    </w:lvl>
+    <w:lvl w:ilvl="7" w:tplc="040C0019" w:tentative="1">
+      <w:start w:val="1"/>
+      <w:numFmt w:val="lowerLetter"/>
+      <w:lvlText w:val="%8."/>
+      <w:lvlJc w:val="left"/>
+      <w:pPr>
+        <w:ind w:left="5760" w:hanging="360"/>
+      </w:pPr>
+    </w:lvl>
+    <w:lvl w:ilvl="8" w:tplc="040C001B" w:tentative="1">
+      <w:start w:val="1"/>
+      <w:numFmt w:val="lowerRoman"/>
+      <w:lvlText w:val="%9."/>
+      <w:lvlJc w:val="right"/>
+      <w:pPr>
+        <w:ind w:left="6480" w:hanging="180"/>
+      </w:pPr>
+    </w:lvl>
+  </w:abstractNum>
+  <w:abstractNum w:abstractNumId="19" w15:restartNumberingAfterBreak="0">
     <w:nsid w:val="454B209C"/>
     <w:multiLevelType w:val="multilevel"/>
     <w:tmpl w:val="912CB4AC"/>
@@ -13388,7 +14528,7 @@
       </w:rPr>
     </w:lvl>
   </w:abstractNum>
-  <w:abstractNum w:abstractNumId="17" w15:restartNumberingAfterBreak="0">
+  <w:abstractNum w:abstractNumId="20" w15:restartNumberingAfterBreak="0">
     <w:nsid w:val="4CAF1D91"/>
     <w:multiLevelType w:val="multilevel"/>
     <w:tmpl w:val="1614669E"/>
@@ -13537,7 +14677,7 @@
       </w:rPr>
     </w:lvl>
   </w:abstractNum>
-  <w:abstractNum w:abstractNumId="18" w15:restartNumberingAfterBreak="0">
+  <w:abstractNum w:abstractNumId="21" w15:restartNumberingAfterBreak="0">
     <w:nsid w:val="53ED6F52"/>
     <w:multiLevelType w:val="multilevel"/>
     <w:tmpl w:val="B32E59B8"/>
@@ -13650,7 +14790,7 @@
       </w:pPr>
     </w:lvl>
   </w:abstractNum>
-  <w:abstractNum w:abstractNumId="19" w15:restartNumberingAfterBreak="0">
+  <w:abstractNum w:abstractNumId="22" w15:restartNumberingAfterBreak="0">
     <w:nsid w:val="561D7082"/>
     <w:multiLevelType w:val="multilevel"/>
     <w:tmpl w:val="0122C124"/>
@@ -13799,7 +14939,7 @@
       </w:rPr>
     </w:lvl>
   </w:abstractNum>
-  <w:abstractNum w:abstractNumId="20" w15:restartNumberingAfterBreak="0">
+  <w:abstractNum w:abstractNumId="23" w15:restartNumberingAfterBreak="0">
     <w:nsid w:val="57F76798"/>
     <w:multiLevelType w:val="hybridMultilevel"/>
     <w:tmpl w:val="A87408C0"/>
@@ -13888,7 +15028,7 @@
       </w:pPr>
     </w:lvl>
   </w:abstractNum>
-  <w:abstractNum w:abstractNumId="21" w15:restartNumberingAfterBreak="0">
+  <w:abstractNum w:abstractNumId="24" w15:restartNumberingAfterBreak="0">
     <w:nsid w:val="5BDF487D"/>
     <w:multiLevelType w:val="multilevel"/>
     <w:tmpl w:val="3430698E"/>
@@ -14037,7 +15177,179 @@
       </w:rPr>
     </w:lvl>
   </w:abstractNum>
-  <w:abstractNum w:abstractNumId="22" w15:restartNumberingAfterBreak="0">
+  <w:abstractNum w:abstractNumId="25" w15:restartNumberingAfterBreak="0">
+    <w:nsid w:val="5FDC5689"/>
+    <w:multiLevelType w:val="hybridMultilevel"/>
+    <w:tmpl w:val="323200F4"/>
+    <w:lvl w:ilvl="0" w:tplc="040C0013">
+      <w:start w:val="1"/>
+      <w:numFmt w:val="upperRoman"/>
+      <w:lvlText w:val="%1."/>
+      <w:lvlJc w:val="right"/>
+      <w:pPr>
+        <w:ind w:left="1776" w:hanging="360"/>
+      </w:pPr>
+    </w:lvl>
+    <w:lvl w:ilvl="1" w:tplc="040C0019" w:tentative="1">
+      <w:start w:val="1"/>
+      <w:numFmt w:val="lowerLetter"/>
+      <w:lvlText w:val="%2."/>
+      <w:lvlJc w:val="left"/>
+      <w:pPr>
+        <w:ind w:left="2496" w:hanging="360"/>
+      </w:pPr>
+    </w:lvl>
+    <w:lvl w:ilvl="2" w:tplc="040C001B" w:tentative="1">
+      <w:start w:val="1"/>
+      <w:numFmt w:val="lowerRoman"/>
+      <w:lvlText w:val="%3."/>
+      <w:lvlJc w:val="right"/>
+      <w:pPr>
+        <w:ind w:left="3216" w:hanging="180"/>
+      </w:pPr>
+    </w:lvl>
+    <w:lvl w:ilvl="3" w:tplc="040C000F" w:tentative="1">
+      <w:start w:val="1"/>
+      <w:numFmt w:val="decimal"/>
+      <w:lvlText w:val="%4."/>
+      <w:lvlJc w:val="left"/>
+      <w:pPr>
+        <w:ind w:left="3936" w:hanging="360"/>
+      </w:pPr>
+    </w:lvl>
+    <w:lvl w:ilvl="4" w:tplc="040C0019" w:tentative="1">
+      <w:start w:val="1"/>
+      <w:numFmt w:val="lowerLetter"/>
+      <w:lvlText w:val="%5."/>
+      <w:lvlJc w:val="left"/>
+      <w:pPr>
+        <w:ind w:left="4656" w:hanging="360"/>
+      </w:pPr>
+    </w:lvl>
+    <w:lvl w:ilvl="5" w:tplc="040C001B" w:tentative="1">
+      <w:start w:val="1"/>
+      <w:numFmt w:val="lowerRoman"/>
+      <w:lvlText w:val="%6."/>
+      <w:lvlJc w:val="right"/>
+      <w:pPr>
+        <w:ind w:left="5376" w:hanging="180"/>
+      </w:pPr>
+    </w:lvl>
+    <w:lvl w:ilvl="6" w:tplc="040C000F" w:tentative="1">
+      <w:start w:val="1"/>
+      <w:numFmt w:val="decimal"/>
+      <w:lvlText w:val="%7."/>
+      <w:lvlJc w:val="left"/>
+      <w:pPr>
+        <w:ind w:left="6096" w:hanging="360"/>
+      </w:pPr>
+    </w:lvl>
+    <w:lvl w:ilvl="7" w:tplc="040C0019" w:tentative="1">
+      <w:start w:val="1"/>
+      <w:numFmt w:val="lowerLetter"/>
+      <w:lvlText w:val="%8."/>
+      <w:lvlJc w:val="left"/>
+      <w:pPr>
+        <w:ind w:left="6816" w:hanging="360"/>
+      </w:pPr>
+    </w:lvl>
+    <w:lvl w:ilvl="8" w:tplc="040C001B" w:tentative="1">
+      <w:start w:val="1"/>
+      <w:numFmt w:val="lowerRoman"/>
+      <w:lvlText w:val="%9."/>
+      <w:lvlJc w:val="right"/>
+      <w:pPr>
+        <w:ind w:left="7536" w:hanging="180"/>
+      </w:pPr>
+    </w:lvl>
+  </w:abstractNum>
+  <w:abstractNum w:abstractNumId="26" w15:restartNumberingAfterBreak="0">
+    <w:nsid w:val="62E81B4C"/>
+    <w:multiLevelType w:val="hybridMultilevel"/>
+    <w:tmpl w:val="E9805278"/>
+    <w:lvl w:ilvl="0" w:tplc="040C0013">
+      <w:start w:val="1"/>
+      <w:numFmt w:val="upperRoman"/>
+      <w:lvlText w:val="%1."/>
+      <w:lvlJc w:val="right"/>
+      <w:pPr>
+        <w:ind w:left="2007" w:hanging="360"/>
+      </w:pPr>
+    </w:lvl>
+    <w:lvl w:ilvl="1" w:tplc="040C0019" w:tentative="1">
+      <w:start w:val="1"/>
+      <w:numFmt w:val="lowerLetter"/>
+      <w:lvlText w:val="%2."/>
+      <w:lvlJc w:val="left"/>
+      <w:pPr>
+        <w:ind w:left="2727" w:hanging="360"/>
+      </w:pPr>
+    </w:lvl>
+    <w:lvl w:ilvl="2" w:tplc="040C001B" w:tentative="1">
+      <w:start w:val="1"/>
+      <w:numFmt w:val="lowerRoman"/>
+      <w:lvlText w:val="%3."/>
+      <w:lvlJc w:val="right"/>
+      <w:pPr>
+        <w:ind w:left="3447" w:hanging="180"/>
+      </w:pPr>
+    </w:lvl>
+    <w:lvl w:ilvl="3" w:tplc="040C000F" w:tentative="1">
+      <w:start w:val="1"/>
+      <w:numFmt w:val="decimal"/>
+      <w:lvlText w:val="%4."/>
+      <w:lvlJc w:val="left"/>
+      <w:pPr>
+        <w:ind w:left="4167" w:hanging="360"/>
+      </w:pPr>
+    </w:lvl>
+    <w:lvl w:ilvl="4" w:tplc="040C0019" w:tentative="1">
+      <w:start w:val="1"/>
+      <w:numFmt w:val="lowerLetter"/>
+      <w:lvlText w:val="%5."/>
+      <w:lvlJc w:val="left"/>
+      <w:pPr>
+        <w:ind w:left="4887" w:hanging="360"/>
+      </w:pPr>
+    </w:lvl>
+    <w:lvl w:ilvl="5" w:tplc="040C001B" w:tentative="1">
+      <w:start w:val="1"/>
+      <w:numFmt w:val="lowerRoman"/>
+      <w:lvlText w:val="%6."/>
+      <w:lvlJc w:val="right"/>
+      <w:pPr>
+        <w:ind w:left="5607" w:hanging="180"/>
+      </w:pPr>
+    </w:lvl>
+    <w:lvl w:ilvl="6" w:tplc="040C000F" w:tentative="1">
+      <w:start w:val="1"/>
+      <w:numFmt w:val="decimal"/>
+      <w:lvlText w:val="%7."/>
+      <w:lvlJc w:val="left"/>
+      <w:pPr>
+        <w:ind w:left="6327" w:hanging="360"/>
+      </w:pPr>
+    </w:lvl>
+    <w:lvl w:ilvl="7" w:tplc="040C0019" w:tentative="1">
+      <w:start w:val="1"/>
+      <w:numFmt w:val="lowerLetter"/>
+      <w:lvlText w:val="%8."/>
+      <w:lvlJc w:val="left"/>
+      <w:pPr>
+        <w:ind w:left="7047" w:hanging="360"/>
+      </w:pPr>
+    </w:lvl>
+    <w:lvl w:ilvl="8" w:tplc="040C001B" w:tentative="1">
+      <w:start w:val="1"/>
+      <w:numFmt w:val="lowerRoman"/>
+      <w:lvlText w:val="%9."/>
+      <w:lvlJc w:val="right"/>
+      <w:pPr>
+        <w:ind w:left="7767" w:hanging="180"/>
+      </w:pPr>
+    </w:lvl>
+  </w:abstractNum>
+  <w:abstractNum w:abstractNumId="27" w15:restartNumberingAfterBreak="0">
     <w:nsid w:val="64AA2816"/>
     <w:multiLevelType w:val="multilevel"/>
     <w:tmpl w:val="0D6AF04A"/>
@@ -14186,7 +15498,7 @@
       </w:rPr>
     </w:lvl>
   </w:abstractNum>
-  <w:abstractNum w:abstractNumId="23" w15:restartNumberingAfterBreak="0">
+  <w:abstractNum w:abstractNumId="28" w15:restartNumberingAfterBreak="0">
     <w:nsid w:val="65B80E31"/>
     <w:multiLevelType w:val="multilevel"/>
     <w:tmpl w:val="590443CE"/>
@@ -14335,7 +15647,7 @@
       </w:rPr>
     </w:lvl>
   </w:abstractNum>
-  <w:abstractNum w:abstractNumId="24" w15:restartNumberingAfterBreak="0">
+  <w:abstractNum w:abstractNumId="29" w15:restartNumberingAfterBreak="0">
     <w:nsid w:val="68C4767A"/>
     <w:multiLevelType w:val="hybridMultilevel"/>
     <w:tmpl w:val="BC162D52"/>
@@ -14424,7 +15736,7 @@
       </w:pPr>
     </w:lvl>
   </w:abstractNum>
-  <w:abstractNum w:abstractNumId="25" w15:restartNumberingAfterBreak="0">
+  <w:abstractNum w:abstractNumId="30" w15:restartNumberingAfterBreak="0">
     <w:nsid w:val="6930353A"/>
     <w:multiLevelType w:val="multilevel"/>
     <w:tmpl w:val="776E4F64"/>
@@ -14573,7 +15885,7 @@
       </w:rPr>
     </w:lvl>
   </w:abstractNum>
-  <w:abstractNum w:abstractNumId="26" w15:restartNumberingAfterBreak="0">
+  <w:abstractNum w:abstractNumId="31" w15:restartNumberingAfterBreak="0">
     <w:nsid w:val="6D535AFD"/>
     <w:multiLevelType w:val="multilevel"/>
     <w:tmpl w:val="94F4B91E"/>
@@ -14722,7 +16034,7 @@
       </w:rPr>
     </w:lvl>
   </w:abstractNum>
-  <w:abstractNum w:abstractNumId="27" w15:restartNumberingAfterBreak="0">
+  <w:abstractNum w:abstractNumId="32" w15:restartNumberingAfterBreak="0">
     <w:nsid w:val="75226422"/>
     <w:multiLevelType w:val="hybridMultilevel"/>
     <w:tmpl w:val="6F86D3AA"/>
@@ -14808,7 +16120,7 @@
       </w:pPr>
     </w:lvl>
   </w:abstractNum>
-  <w:abstractNum w:abstractNumId="28" w15:restartNumberingAfterBreak="0">
+  <w:abstractNum w:abstractNumId="33" w15:restartNumberingAfterBreak="0">
     <w:nsid w:val="75BE51A3"/>
     <w:multiLevelType w:val="multilevel"/>
     <w:tmpl w:val="94F4B91E"/>
@@ -14957,44 +16269,133 @@
       </w:rPr>
     </w:lvl>
   </w:abstractNum>
+  <w:abstractNum w:abstractNumId="34" w15:restartNumberingAfterBreak="0">
+    <w:nsid w:val="77275B6D"/>
+    <w:multiLevelType w:val="hybridMultilevel"/>
+    <w:tmpl w:val="EEA6D9AE"/>
+    <w:lvl w:ilvl="0" w:tplc="97E6ED04">
+      <w:start w:val="1"/>
+      <w:numFmt w:val="upperRoman"/>
+      <w:lvlText w:val="%1."/>
+      <w:lvlJc w:val="right"/>
+      <w:pPr>
+        <w:ind w:left="1776" w:hanging="360"/>
+      </w:pPr>
+      <w:rPr>
+        <w:sz w:val="32"/>
+      </w:rPr>
+    </w:lvl>
+    <w:lvl w:ilvl="1" w:tplc="040C0019" w:tentative="1">
+      <w:start w:val="1"/>
+      <w:numFmt w:val="lowerLetter"/>
+      <w:lvlText w:val="%2."/>
+      <w:lvlJc w:val="left"/>
+      <w:pPr>
+        <w:ind w:left="2496" w:hanging="360"/>
+      </w:pPr>
+    </w:lvl>
+    <w:lvl w:ilvl="2" w:tplc="040C001B" w:tentative="1">
+      <w:start w:val="1"/>
+      <w:numFmt w:val="lowerRoman"/>
+      <w:lvlText w:val="%3."/>
+      <w:lvlJc w:val="right"/>
+      <w:pPr>
+        <w:ind w:left="3216" w:hanging="180"/>
+      </w:pPr>
+    </w:lvl>
+    <w:lvl w:ilvl="3" w:tplc="040C000F" w:tentative="1">
+      <w:start w:val="1"/>
+      <w:numFmt w:val="decimal"/>
+      <w:lvlText w:val="%4."/>
+      <w:lvlJc w:val="left"/>
+      <w:pPr>
+        <w:ind w:left="3936" w:hanging="360"/>
+      </w:pPr>
+    </w:lvl>
+    <w:lvl w:ilvl="4" w:tplc="040C0019" w:tentative="1">
+      <w:start w:val="1"/>
+      <w:numFmt w:val="lowerLetter"/>
+      <w:lvlText w:val="%5."/>
+      <w:lvlJc w:val="left"/>
+      <w:pPr>
+        <w:ind w:left="4656" w:hanging="360"/>
+      </w:pPr>
+    </w:lvl>
+    <w:lvl w:ilvl="5" w:tplc="040C001B" w:tentative="1">
+      <w:start w:val="1"/>
+      <w:numFmt w:val="lowerRoman"/>
+      <w:lvlText w:val="%6."/>
+      <w:lvlJc w:val="right"/>
+      <w:pPr>
+        <w:ind w:left="5376" w:hanging="180"/>
+      </w:pPr>
+    </w:lvl>
+    <w:lvl w:ilvl="6" w:tplc="040C000F" w:tentative="1">
+      <w:start w:val="1"/>
+      <w:numFmt w:val="decimal"/>
+      <w:lvlText w:val="%7."/>
+      <w:lvlJc w:val="left"/>
+      <w:pPr>
+        <w:ind w:left="6096" w:hanging="360"/>
+      </w:pPr>
+    </w:lvl>
+    <w:lvl w:ilvl="7" w:tplc="040C0019" w:tentative="1">
+      <w:start w:val="1"/>
+      <w:numFmt w:val="lowerLetter"/>
+      <w:lvlText w:val="%8."/>
+      <w:lvlJc w:val="left"/>
+      <w:pPr>
+        <w:ind w:left="6816" w:hanging="360"/>
+      </w:pPr>
+    </w:lvl>
+    <w:lvl w:ilvl="8" w:tplc="040C001B" w:tentative="1">
+      <w:start w:val="1"/>
+      <w:numFmt w:val="lowerRoman"/>
+      <w:lvlText w:val="%9."/>
+      <w:lvlJc w:val="right"/>
+      <w:pPr>
+        <w:ind w:left="7536" w:hanging="180"/>
+      </w:pPr>
+    </w:lvl>
+  </w:abstractNum>
   <w:num w:numId="1">
-    <w:abstractNumId w:val="19"/>
+    <w:abstractNumId w:val="22"/>
   </w:num>
   <w:num w:numId="2">
-    <w:abstractNumId w:val="6"/>
+    <w:abstractNumId w:val="7"/>
   </w:num>
   <w:num w:numId="3">
-    <w:abstractNumId w:val="22"/>
+    <w:abstractNumId w:val="27"/>
   </w:num>
   <w:num w:numId="4">
     <w:abstractNumId w:val="0"/>
   </w:num>
   <w:num w:numId="5">
+    <w:abstractNumId w:val="9"/>
+  </w:num>
+  <w:num w:numId="6">
+    <w:abstractNumId w:val="20"/>
+  </w:num>
+  <w:num w:numId="7">
+    <w:abstractNumId w:val="6"/>
+  </w:num>
+  <w:num w:numId="8">
+    <w:abstractNumId w:val="12"/>
+  </w:num>
+  <w:num w:numId="9">
     <w:abstractNumId w:val="8"/>
   </w:num>
-  <w:num w:numId="6">
-    <w:abstractNumId w:val="17"/>
-  </w:num>
-  <w:num w:numId="7">
-    <w:abstractNumId w:val="5"/>
-  </w:num>
-  <w:num w:numId="8">
-    <w:abstractNumId w:val="11"/>
-  </w:num>
-  <w:num w:numId="9">
-    <w:abstractNumId w:val="7"/>
-  </w:num>
   <w:num w:numId="10">
-    <w:abstractNumId w:val="23"/>
+    <w:abstractNumId w:val="28"/>
   </w:num>
   <w:num w:numId="11">
-    <w:abstractNumId w:val="16"/>
+    <w:abstractNumId w:val="19"/>
   </w:num>
   <w:num w:numId="12">
-    <w:abstractNumId w:val="21"/>
+    <w:abstractNumId w:val="24"/>
   </w:num>
   <w:num w:numId="13">
-    <w:abstractNumId w:val="25"/>
+    <w:abstractNumId w:val="30"/>
   </w:num>
   <w:num w:numId="14">
     <w:abstractNumId w:val="4"/>
@@ -15003,31 +16404,31 @@
     <w:abstractNumId w:val="2"/>
   </w:num>
   <w:num w:numId="16">
+    <w:abstractNumId w:val="11"/>
+  </w:num>
+  <w:num w:numId="17">
+    <w:abstractNumId w:val="32"/>
+  </w:num>
+  <w:num w:numId="18">
+    <w:abstractNumId w:val="13"/>
+  </w:num>
+  <w:num w:numId="19">
     <w:abstractNumId w:val="10"/>
   </w:num>
-  <w:num w:numId="17">
-    <w:abstractNumId w:val="27"/>
-  </w:num>
-  <w:num w:numId="18">
-    <w:abstractNumId w:val="12"/>
-  </w:num>
-  <w:num w:numId="19">
-    <w:abstractNumId w:val="9"/>
-  </w:num>
   <w:num w:numId="20">
-    <w:abstractNumId w:val="14"/>
+    <w:abstractNumId w:val="16"/>
   </w:num>
   <w:num w:numId="21">
-    <w:abstractNumId w:val="13"/>
+    <w:abstractNumId w:val="15"/>
   </w:num>
   <w:num w:numId="22">
     <w:abstractNumId w:val="3"/>
   </w:num>
   <w:num w:numId="23">
-    <w:abstractNumId w:val="26"/>
+    <w:abstractNumId w:val="31"/>
   </w:num>
   <w:num w:numId="24">
-    <w:abstractNumId w:val="26"/>
+    <w:abstractNumId w:val="31"/>
     <w:lvlOverride w:ilvl="1">
       <w:lvl w:ilvl="1">
         <w:numFmt w:val="bullet"/>
@@ -15047,22 +16448,40 @@
     </w:lvlOverride>
   </w:num>
   <w:num w:numId="25">
-    <w:abstractNumId w:val="28"/>
+    <w:abstractNumId w:val="33"/>
   </w:num>
   <w:num w:numId="26">
-    <w:abstractNumId w:val="15"/>
+    <w:abstractNumId w:val="17"/>
   </w:num>
   <w:num w:numId="27">
-    <w:abstractNumId w:val="24"/>
+    <w:abstractNumId w:val="29"/>
   </w:num>
   <w:num w:numId="28">
     <w:abstractNumId w:val="1"/>
   </w:num>
   <w:num w:numId="29">
-    <w:abstractNumId w:val="18"/>
+    <w:abstractNumId w:val="21"/>
   </w:num>
   <w:num w:numId="30">
-    <w:abstractNumId w:val="20"/>
+    <w:abstractNumId w:val="23"/>
+  </w:num>
+  <w:num w:numId="31">
+    <w:abstractNumId w:val="14"/>
+  </w:num>
+  <w:num w:numId="32">
+    <w:abstractNumId w:val="5"/>
+  </w:num>
+  <w:num w:numId="33">
+    <w:abstractNumId w:val="25"/>
+  </w:num>
+  <w:num w:numId="34">
+    <w:abstractNumId w:val="26"/>
+  </w:num>
+  <w:num w:numId="35">
+    <w:abstractNumId w:val="34"/>
+  </w:num>
+  <w:num w:numId="36">
+    <w:abstractNumId w:val="18"/>
   </w:num>
 </w:numbering>
 </file>
@@ -15724,6 +17143,77 @@
       <w:spacing w:val="5"/>
     </w:rPr>
   </w:style>
+  <w:style w:type="paragraph" w:styleId="NormalWeb">
+    <w:name w:val="Normal (Web)"/>
+    <w:basedOn w:val="Normal"/>
+    <w:uiPriority w:val="99"/>
+    <w:semiHidden/>
+    <w:unhideWhenUsed/>
+    <w:rsid w:val="00E03155"/>
+    <w:pPr>
+      <w:spacing w:before="100" w:beforeAutospacing="1" w:after="100" w:afterAutospacing="1" w:line="240" w:lineRule="auto"/>
+    </w:pPr>
+    <w:rPr>
+      <w:rFonts w:ascii="Times New Roman" w:eastAsia="Times New Roman" w:hAnsi="Times New Roman" w:cs="Times New Roman"/>
+      <w:sz w:val="24"/>
+      <w:szCs w:val="24"/>
+      <w:lang w:eastAsia="fr-FR"/>
+    </w:rPr>
+  </w:style>
+  <w:style w:type="character" w:customStyle="1" w:styleId="cf01">
+    <w:name w:val="cf01"/>
+    <w:basedOn w:val="Policepardfaut"/>
+    <w:rsid w:val="00E03155"/>
+    <w:rPr>
+      <w:rFonts w:ascii="Consolas" w:hAnsi="Consolas" w:hint="default"/>
+      <w:sz w:val="28"/>
+      <w:szCs w:val="28"/>
+    </w:rPr>
+  </w:style>
+  <w:style w:type="character" w:customStyle="1" w:styleId="cf11">
+    <w:name w:val="cf11"/>
+    <w:basedOn w:val="Policepardfaut"/>
+    <w:rsid w:val="00E03155"/>
+    <w:rPr>
+      <w:rFonts w:ascii="Consolas" w:hAnsi="Consolas" w:hint="default"/>
+      <w:sz w:val="34"/>
+      <w:szCs w:val="34"/>
+    </w:rPr>
+  </w:style>
+  <w:style w:type="character" w:customStyle="1" w:styleId="cf21">
+    <w:name w:val="cf21"/>
+    <w:basedOn w:val="Policepardfaut"/>
+    <w:rsid w:val="00E03155"/>
+    <w:rPr>
+      <w:rFonts w:ascii="Consolas" w:hAnsi="Consolas" w:hint="default"/>
+      <w:b/>
+      <w:bCs/>
+      <w:sz w:val="34"/>
+      <w:szCs w:val="34"/>
+    </w:rPr>
+  </w:style>
+  <w:style w:type="character" w:customStyle="1" w:styleId="cf31">
+    <w:name w:val="cf31"/>
+    <w:basedOn w:val="Policepardfaut"/>
+    <w:rsid w:val="00E03155"/>
+    <w:rPr>
+      <w:rFonts w:ascii="Consolas" w:hAnsi="Consolas" w:hint="default"/>
+      <w:b/>
+      <w:bCs/>
+      <w:sz w:val="28"/>
+      <w:szCs w:val="28"/>
+    </w:rPr>
+  </w:style>
+  <w:style w:type="character" w:customStyle="1" w:styleId="cf41">
+    <w:name w:val="cf41"/>
+    <w:basedOn w:val="Policepardfaut"/>
+    <w:rsid w:val="00E03155"/>
+    <w:rPr>
+      <w:rFonts w:ascii="Consolas" w:hAnsi="Consolas" w:hint="default"/>
+      <w:sz w:val="28"/>
+      <w:szCs w:val="28"/>
+    </w:rPr>
+  </w:style>
 </w:styles>
 </file>
 
@@ -16014,7 +17504,7 @@
 </file>
 
 <file path=customXml/itemProps1.xml><?xml version="1.0" encoding="utf-8"?>
-<ds:datastoreItem xmlns:ds="http://schemas.openxmlformats.org/officeDocument/2006/customXml" ds:itemID="{37E7EF98-849A-4FF5-A8CA-6F7F5B43629B}">
+<ds:datastoreItem xmlns:ds="http://schemas.openxmlformats.org/officeDocument/2006/customXml" ds:itemID="{4C7396EB-BC23-407F-8897-EAC8A93BBA3A}">
   <ds:schemaRefs>
     <ds:schemaRef ds:uri="http://schemas.openxmlformats.org/officeDocument/2006/bibliography"/>
   </ds:schemaRefs>

</xml_diff>